<commit_message>
fix(gdp_tempo): add 7 missing references to JA manuscript
Devin Review correctly identified that 7 references cited in the JA body
text were missing from the JA reference list after the MD style conversion:
- Altug (1989)
- Christiano and Todd (1996)
- Edge (2007)
- Griliches (1996)
- Hulten (1992)
- Jorgenson and Griliches (1967)
- Nishimura and Saita (2005)

All 7 entries copied from the EN reference list to ensure exact consistency.
JA docx rebuilt.

Co-Authored-By: Tatsuki Onishi <bougtoir@gmail.com>
</commit_message>
<xml_diff>
--- a/gdp_tempo_paper/manuscript/manuscript_ja.docx
+++ b/gdp_tempo_paper/manuscript/manuscript_ja.docx
@@ -6984,6 +6984,21 @@
           <w:i w:val="0"/>
           <w:sz w:val="24"/>
         </w:rPr>
+        <w:t>Altug, Sumru (1989) Time-to-build and aggregate fluctuations: some new evidence. International Economic Review 30, 889–920.</w:t>
+      </w:r>
+    </w:p>
+    <w:p>
+      <w:pPr>
+        <w:spacing w:after="120" w:line="480" w:lineRule="auto"/>
+        <w:ind w:firstLine="480"/>
+      </w:pPr>
+      <w:r>
+        <w:rPr>
+          <w:rFonts w:ascii="Times New Roman" w:hAnsi="Times New Roman" w:eastAsia="MS Mincho"/>
+          <w:b w:val="0"/>
+          <w:i w:val="0"/>
+          <w:sz w:val="24"/>
+        </w:rPr>
         <w:t>Arrow, Kenneth J., Partha Dasgupta, Lawrence H. Goulder, Kevin J. Mumford, and Kirsten Oleson (2012) Sustainability and the measurement of wealth. Environment and Development Economics 17, 317–353.</w:t>
       </w:r>
     </w:p>
@@ -7044,6 +7059,21 @@
           <w:i w:val="0"/>
           <w:sz w:val="24"/>
         </w:rPr>
+        <w:t>Christiano, Lawrence J. and Richard M. Todd (1996) Time to plan and aggregate fluctuations. Federal Reserve Bank of Minneapolis Quarterly Review 20, 14–27.</w:t>
+      </w:r>
+    </w:p>
+    <w:p>
+      <w:pPr>
+        <w:spacing w:after="120" w:line="480" w:lineRule="auto"/>
+        <w:ind w:firstLine="480"/>
+      </w:pPr>
+      <w:r>
+        <w:rPr>
+          <w:rFonts w:ascii="Times New Roman" w:hAnsi="Times New Roman" w:eastAsia="MS Mincho"/>
+          <w:b w:val="0"/>
+          <w:i w:val="0"/>
+          <w:sz w:val="24"/>
+        </w:rPr>
         <w:t>Corrado, Carol, Charles Hulten, and Daniel Sichel (2005) Measuring capital and technology: an expanded framework. In Carol Corrado, John Haltiwanger, and Daniel Sichel (eds.), Measuring Capital in the New Economy, pp. 11–46. Chicago: University of Chicago Press.</w:t>
       </w:r>
     </w:p>
@@ -7134,6 +7164,21 @@
           <w:i w:val="0"/>
           <w:sz w:val="24"/>
         </w:rPr>
+        <w:t>Edge, Rochelle M. (2007) Time-to-build, time-to-plan, habit-persistence, and the liquidity effect. Journal of Monetary Economics 54, 1644–1669.</w:t>
+      </w:r>
+    </w:p>
+    <w:p>
+      <w:pPr>
+        <w:spacing w:after="120" w:line="480" w:lineRule="auto"/>
+        <w:ind w:firstLine="480"/>
+      </w:pPr>
+      <w:r>
+        <w:rPr>
+          <w:rFonts w:ascii="Times New Roman" w:hAnsi="Times New Roman" w:eastAsia="MS Mincho"/>
+          <w:b w:val="0"/>
+          <w:i w:val="0"/>
+          <w:sz w:val="24"/>
+        </w:rPr>
         <w:t>Feenstra, Robert C., Robert Inklaar, and Marcel P. Timmer (2015) The next generation of the Penn World Table. American Economic Review 105, 3150–3182.</w:t>
       </w:r>
     </w:p>
@@ -7164,6 +7209,21 @@
           <w:i w:val="0"/>
           <w:sz w:val="24"/>
         </w:rPr>
+        <w:t>Griliches, Zvi (1996) The discovery of the residual: a historical note. Journal of Economic Literature 34, 1324–1330.</w:t>
+      </w:r>
+    </w:p>
+    <w:p>
+      <w:pPr>
+        <w:spacing w:after="120" w:line="480" w:lineRule="auto"/>
+        <w:ind w:firstLine="480"/>
+      </w:pPr>
+      <w:r>
+        <w:rPr>
+          <w:rFonts w:ascii="Times New Roman" w:hAnsi="Times New Roman" w:eastAsia="MS Mincho"/>
+          <w:b w:val="0"/>
+          <w:i w:val="0"/>
+          <w:sz w:val="24"/>
+        </w:rPr>
         <w:t>Hamano, Masashige and Yongchao Zhao (2017) Fiscal sustainability and land prices in Japan. Journal of the Japanese and International Economies 46, 17–29.</w:t>
       </w:r>
     </w:p>
@@ -7209,7 +7269,37 @@
           <w:i w:val="0"/>
           <w:sz w:val="24"/>
         </w:rPr>
+        <w:t>Hulten, Charles R. (1992) Growth accounting when technical change is embodied in capital. American Economic Review 82, 964–980.</w:t>
+      </w:r>
+    </w:p>
+    <w:p>
+      <w:pPr>
+        <w:spacing w:after="120" w:line="480" w:lineRule="auto"/>
+        <w:ind w:firstLine="480"/>
+      </w:pPr>
+      <w:r>
+        <w:rPr>
+          <w:rFonts w:ascii="Times New Roman" w:hAnsi="Times New Roman" w:eastAsia="MS Mincho"/>
+          <w:b w:val="0"/>
+          <w:i w:val="0"/>
+          <w:sz w:val="24"/>
+        </w:rPr>
         <w:t>Inklaar, Robert and Marcel P. Timmer (2013) Capital, labor and TFP in PWT 8.0. Groningen Growth and Development Centre Research Memorandum GD-144.</w:t>
+      </w:r>
+    </w:p>
+    <w:p>
+      <w:pPr>
+        <w:spacing w:after="120" w:line="480" w:lineRule="auto"/>
+        <w:ind w:firstLine="480"/>
+      </w:pPr>
+      <w:r>
+        <w:rPr>
+          <w:rFonts w:ascii="Times New Roman" w:hAnsi="Times New Roman" w:eastAsia="MS Mincho"/>
+          <w:b w:val="0"/>
+          <w:i w:val="0"/>
+          <w:sz w:val="24"/>
+        </w:rPr>
+        <w:t>Jorgenson, Dale W. and Zvi Griliches (1967) The explanation of productivity change. Review of Economic Studies 34, 249–283.</w:t>
       </w:r>
     </w:p>
     <w:p>
@@ -7345,6 +7435,21 @@
           <w:sz w:val="24"/>
         </w:rPr>
         <w:t>Mayer, Thomas (1960) Plant and equipment lead times. Journal of Business 33, 127–132.</w:t>
+      </w:r>
+    </w:p>
+    <w:p>
+      <w:pPr>
+        <w:spacing w:after="120" w:line="480" w:lineRule="auto"/>
+        <w:ind w:firstLine="480"/>
+      </w:pPr>
+      <w:r>
+        <w:rPr>
+          <w:rFonts w:ascii="Times New Roman" w:hAnsi="Times New Roman" w:eastAsia="MS Mincho"/>
+          <w:b w:val="0"/>
+          <w:i w:val="0"/>
+          <w:sz w:val="24"/>
+        </w:rPr>
+        <w:t>Nishimura, Kiyohiko G. and Yumi Saita (2005) Land prices in Japan: historical and international comparisons. Bank of Japan Review 2005-E-5.</w:t>
       </w:r>
     </w:p>
     <w:p>

</xml_diff>

<commit_message>
Add tempo-novelty argument to intro + cover letter; fix III.5 → 3.5 JA cross-ref
- Introduction (EN+JA): tempo adjustment was forgotten within demography for
  decades; applying it to capital accounting for the first time cannot lack
  empirical content
- Cover letter: add novelty sentence about first transplant of tempo framework
  to GDP measurement
- Fix manuscript_ja.md: 'III.5 節' → '3.5 節' (missed in initial conversion)
- Fix convert_to_jeg.py: generalize III.3 → III.(\d+) pattern for JA cross-refs

Co-Authored-By: Tatsuki Onishi <bougtoir@gmail.com>
</commit_message>
<xml_diff>
--- a/gdp_tempo_paper/manuscript/manuscript_ja.docx
+++ b/gdp_tempo_paper/manuscript/manuscript_ja.docx
@@ -525,7 +525,7 @@
           <w:i w:val="0"/>
           <w:sz w:val="24"/>
         </w:rPr>
-        <w:t>本稿は、人口統計学との構造的類似性を利用し、両パラメータを同時に同定する。Bongaarts and Feeney (1998) が平均出産年齢のドリフトが完結出生率一定でも期間出生率を押し下げることを示し、Goldstein, Lutz, and Scherbov (2003) が単一の「忘れられた」パリティ別分散パラメータを加えると矛盾が解消することを示した。同じ数学が、精密な変数変換のもとで資本会計に適用される（表 2）。</w:t>
+        <w:t>本稿は、人口統計学との構造的類似性を利用し、両パラメータを同時に同定する。Bongaarts and Feeney (1998) が平均出産年齢のドリフトが完結出生率一定でも期間出生率を押し下げることを示し、Goldstein, Lutz, and Scherbov (2003) が単一の「忘れられた」パリティ別分散パラメータを加えると矛盾が解消することを示した。同じ数学が、精密な変数変換のもとで資本会計に適用される（表 2）。注目すべきは、テンポ調整それ自体が人口学の内部ですら数十年にわたり忘れられた洞察であったことである。出生テンポ文献は1970年代の定式化以降、Bongaarts and Feeney が1998年に復活させるまで休眠状態にあり、忘れられた分散パラメータが Goldstein, Lutz, and Scherbov によって補填されるにはさらに5年を要した。人口学者の目の前に一世代にわたり存在していたタイミング補正が、再発見されるや変革的であったとすれば、同一の補正が――資本会計およびGDP計測というはるかに広大な領域に初めて適用される場合に――新たな実証的内容を持たないとすれば、むしろ驚きであろう。</w:t>
       </w:r>
     </w:p>
     <w:p>
@@ -7401,7 +7401,7 @@
           <w:i w:val="0"/>
           <w:sz w:val="24"/>
         </w:rPr>
-        <w:t>図 6 と表 3 に III.5 節で定義した関係型 PIM 診断を報告する。二つの発見が際立つ。第一に、M0（即時 PIM、</w:t>
+        <w:t>図 6 と表 3 に 3.5 節で定義した関係型 PIM 診断を報告する。二つの発見が際立つ。第一に、M0（即時 PIM、</w:t>
       </w:r>
       <w:r>
         <w:rPr>

</xml_diff>